<commit_message>
Eduardo Costa: revisão da Parte 1
Co-Authored-By: Claude Opus 5.5 <noreply@anthropic.com>
Claude-Session: https://claude.ai/code/session_01MJjUEEZrxQDEUifKK2vj9g
</commit_message>
<xml_diff>
--- a/roteiros/eduardo-costa/EduardoCosta_Parte1.docx
+++ b/roteiros/eduardo-costa/EduardoCosta_Parte1.docx
@@ -47,7 +47,7 @@
         <w:rPr>
           <w:color w:val="000000"/>
         </w:rPr>
-        <w:t>Treze de dezembro.</w:t>
+        <w:t>Treze de dezembro de mil novecentos e setenta e nove, segundo a maior parte das biografias.</w:t>
       </w:r>
     </w:p>
     <w:p>
@@ -215,7 +215,7 @@
         <w:rPr>
           <w:color w:val="000000"/>
         </w:rPr>
-        <w:t>Eduardo passou pelo interior de Minas. Depois foi para Goiás. Depois, para São Paulo.</w:t>
+        <w:t>Rodou pelo interior de três estados diferentes, longe dos pais.</w:t>
       </w:r>
     </w:p>
     <w:p>

</xml_diff>